<commit_message>
v8: GCFM + AnyLogic Linear Service 방식 게이트 통과
시뮬레이션 변경:
- SFM -> GCFM (GeneralizedCentrifugalForceModel) 교체
  - SFM 벽 관통 문제 해결 (에이전트 accessible area 이탈 에러)
  - 타원형 보행자: 좁은 공간 접근 시 어깨축 축소
- AnyLogic Linear Service 방식 게이트 통과 구현
  - 기존: 서비스 완료 -> 즉시 exit switch (텔레포트)
  - 수정: 서비스 완료 -> 0.65m/s로 게이트 출구까지 걸어서 이동
         -> 게이트 출구 통과 확인 후 exit switch
  - 태그리스: 일반 속도로 게이트를 걸어서 통과 (무정지)
- 결과: 77명 전원 통과, stuck 0명

방법론 문서 보강:
- GCFM 선정 이유를 선행연구 기반으로 작성
  - Chraibi et al. (2010): SFM 겹침/진동 해결, 타원형 병목 검증
  - Jain et al. (2025): 벤치마크에서 CFM > SFM 성능
  - Lin et al. (2023): 힘 기반 모델의 게이트 앞 자연 대기행렬 형성

Co-Authored-By: Claude Opus 4.6 (1M context) <noreply@anthropic.com>
</commit_message>
<xml_diff>
--- a/output/방법론_세팅_및_필요데이터.docx
+++ b/output/방법론_세팅_및_필요데이터.docx
@@ -90,39 +90,27 @@
     </w:p>
     <w:p>
       <w:r>
-        <w:t>GCFM 선정 이유:</w:t>
+        <w:t>GCFM 선정 이유 (선행연구 기반):</w:t>
       </w:r>
     </w:p>
     <w:p>
-      <w:pPr>
-        <w:pStyle w:val="ListBullet"/>
-      </w:pPr>
       <w:r>
-        <w:t>SFM 계열의 힘(force) 기반 모델로, 대기행렬에서 줄서기 행태가 자연 발생 (전방 인력 + 후방 압력의 균형)</w:t>
+        <w:t>첫째, SFM의 구조적 한계 해결. Chraibi et al. (2010)은 기존 SFM에서 발생하는 보행자 간 겹침(overlapping), 비현실적 진동(oscillation), 속도 이상 문제를 GCFM이 해결함을 보였다. Jain et al. (2025)의 벤치마크 연구에서도 SFM(원형/타원형 모두)은 병목 시나리오에서 80% 이상 성공률을 달성하지 못한 반면, CFM 계열이 상대적으로 양호한 성능을 보였다.</w:t>
       </w:r>
     </w:p>
     <w:p>
-      <w:pPr>
-        <w:pStyle w:val="ListBullet"/>
-      </w:pPr>
       <w:r>
-        <w:t>타원형 보행자 모델 - 보행 속도에 따라 어깨축이 축소되어 좁은 공간 접근 시 현실적 체형 변화 반영</w:t>
+        <w:t>둘째, 타원형 보행자 모델에 의한 현실적 병목 통과. GCFM은 보행자를 원형이 아닌 타원형으로 모델링하며, 보행 속도에 따라 어깨축(b)이 축소된다. Chraibi et al. (2010)은 원형 모델이 보행자의 비대칭적 공간 점유(진행 방향 vs 어깨 방향)를 반영하지 못함을 지적하며, 타원형 모델이 좁은 병목(bottleneck)에서 실험 데이터와 더 잘 일치함을 다양한 출구 폭 실험으로 검증하였다.</w:t>
       </w:r>
     </w:p>
     <w:p>
-      <w:pPr>
-        <w:pStyle w:val="ListBullet"/>
-      </w:pPr>
       <w:r>
-        <w:t>JuPedSim 개발팀(율리히 연구소)이 직접 개발한 모델로 프레임워크와의 호환성 최적</w:t>
+        <w:t>셋째, 힘 기반 모델의 대기행렬 형성. Lin et al. (2023)은 Modified SFM을 이용하여 지하철 게이트 기계가 보행자 흐름에 미치는 영향을 시뮬레이션하였다. 힘 기반 모델에서 게이트 앞 보행자는 전방 인력과 후방 압력의 균형으로 자연스러운 줄서기(fan/arch 형태)를 형성하며, 이는 속도 기반 모델(CFSM 등)에서 코드로 강제해야 하는 행태이다. 게이트가 적절히 배치되면 오히려 보행자 흐름을 질서화하여 통과 효율을 높일 수 있음을 보였다.</w:t>
       </w:r>
     </w:p>
     <w:p>
-      <w:pPr>
-        <w:pStyle w:val="ListBullet"/>
-      </w:pPr>
       <w:r>
-        <w:t>PTV Viswalk 등 상용 소프트웨어도 SFM/힘 기반 모델을 채택하고 있어 방법론적 정합성 확보</w:t>
+        <w:t>넷째, PTV Viswalk 등 상용 소프트웨어도 SFM/힘 기반 모델을 채택하고 있어 방법론적 정합성이 확보된다. 또한 GCFM은 JuPedSim 개발팀(율리히 연구소)이 직접 개발한 모델로 프레임워크와의 호환성이 최적이다.</w:t>
       </w:r>
     </w:p>
     <w:p>

</xml_diff>